<commit_message>
Modif de CDC parties Mathieu
Modification de ma partie suite au vocal du 2026-10-20
</commit_message>
<xml_diff>
--- a/CDC parties Mathieu.docx
+++ b/CDC parties Mathieu.docx
@@ -279,16 +279,7 @@
         </w:numPr>
       </w:pPr>
       <w:r>
-        <w:t>M</w:t>
-      </w:r>
-      <w:r>
-        <w:t>algré quelques</w:t>
-      </w:r>
-      <w:r>
-        <w:t xml:space="preserve"> ouvertures dans le level design qui permettent de ne pas être bloqué sur un seul puzzle à la fois,</w:t>
-      </w:r>
-      <w:r>
-        <w:t xml:space="preserve"> </w:t>
+        <w:t xml:space="preserve">Malgré quelques ouvertures dans le level design qui permettent de ne pas être bloqué sur un seul puzzle à la fois, </w:t>
       </w:r>
       <w:r>
         <w:rPr>
@@ -453,43 +444,6 @@
     <w:p>
       <w:r>
         <w:t>Différences :</w:t>
-      </w:r>
-    </w:p>
-    <w:p>
-      <w:pPr>
-        <w:pStyle w:val="Paragraphedeliste"/>
-        <w:numPr>
-          <w:ilvl w:val="0"/>
-          <w:numId w:val="2"/>
-        </w:numPr>
-      </w:pPr>
-      <w:r>
-        <w:t xml:space="preserve">Vue en première personne pour </w:t>
-      </w:r>
-      <w:r>
-        <w:rPr>
-          <w:i/>
-          <w:iCs/>
-        </w:rPr>
-        <w:t>Big Walk</w:t>
-      </w:r>
-      <w:r>
-        <w:t xml:space="preserve">, contrairement à notre jeu qui nécessite un point de vue extérieur (même si techniquement </w:t>
-      </w:r>
-      <w:r>
-        <w:t xml:space="preserve">notre </w:t>
-      </w:r>
-      <w:r>
-        <w:t>vision</w:t>
-      </w:r>
-      <w:r>
-        <w:t xml:space="preserve"> peut être considérée comme la </w:t>
-      </w:r>
-      <w:r>
-        <w:t>vue</w:t>
-      </w:r>
-      <w:r>
-        <w:t xml:space="preserve"> subjective de l’entité qui observe la civilisation).</w:t>
       </w:r>
     </w:p>
     <w:p>

</xml_diff>